<commit_message>
docs: audit and harmonize repository documentation, quarantine internal review materials, and enforce public scope
</commit_message>
<xml_diff>
--- a/docs/AUDITED_COMMERCIAL_CDS_AND_FOUNDATION_BENCHMARK_REPORT.docx
+++ b/docs/AUDITED_COMMERCIAL_CDS_AND_FOUNDATION_BENCHMARK_REPORT.docx
@@ -20,7 +20,7 @@
           <w:b/>
           <w:bCs/>
         </w:rPr>
-        <w:t xml:space="preserve">A Zero-Trust Forensic Analysis of 72 Commercial CDS Encounters, 1,324 Foundation Model Traces, and the Mechanics of Generative Clinical Reasoning</w:t>
+        <w:t xml:space="preserve">A Zero-Trust Forensic Analysis of 84 Commercial CDS Encounters, 1,324 Foundation Model Traces, and the Mechanics of Generative Clinical Reasoning</w:t>
       </w:r>
     </w:p>
     <w:p>
@@ -100,7 +100,7 @@
         <w:rPr>
           <w:rStyle w:val="VerbatimChar"/>
         </w:rPr>
-        <w:t xml:space="preserve">docs/reviews/COMMERCIAL_CDS_COMPLETE_EVIDENCE_2026-09-09.json</w:t>
+        <w:t xml:space="preserve">results/cds/</w:t>
       </w:r>
       <w:r>
         <w:t xml:space="preserve"> </w:t>
@@ -119,14 +119,14 @@
           <m:t>=</m:t>
         </m:r>
         <m:r>
-          <m:t>72</m:t>
+          <m:t>84</m:t>
         </m:r>
       </m:oMath>
       <w:r>
         <w:t xml:space="preserve"> </w:t>
       </w:r>
       <w:r>
-        <w:t xml:space="preserve">verified runs)</w:t>
+        <w:t xml:space="preserve">verified runs across 7 platforms)</w:t>
       </w:r>
       <w:r>
         <w:t xml:space="preserve"> </w:t>
@@ -282,7 +282,7 @@
           <m:t>=</m:t>
         </m:r>
         <m:r>
-          <m:t>72</m:t>
+          <m:t>84</m:t>
         </m:r>
       </m:oMath>
       <w:r>
@@ -303,7 +303,7 @@
         <w:t xml:space="preserve"> </w:t>
       </w:r>
       <w:r>
-        <w:t xml:space="preserve">6 commercial clinical AI platforms (</w:t>
+        <w:t xml:space="preserve">7 commercial clinical AI platforms (</w:t>
       </w:r>
       <w:r>
         <w:rPr>
@@ -365,6 +365,19 @@
         <w:t xml:space="preserve">Ask Doximity</w:t>
       </w:r>
       <w:r>
+        <w:t xml:space="preserve">,</w:t>
+      </w:r>
+      <w:r>
+        <w:t xml:space="preserve"> </w:t>
+      </w:r>
+      <w:r>
+        <w:rPr>
+          <w:b/>
+          <w:bCs/>
+        </w:rPr>
+        <w:t xml:space="preserve">ChatGPT for Clinicians</w:t>
+      </w:r>
+      <w:r>
         <w:t xml:space="preserve">, and</w:t>
       </w:r>
       <w:r>
@@ -375,7 +388,7 @@
           <w:b/>
           <w:bCs/>
         </w:rPr>
-        <w:t xml:space="preserve">ChatGPT for Clinicians</w:t>
+        <w:t xml:space="preserve">Glass Health</w:t>
       </w:r>
       <w:r>
         <w:t xml:space="preserve">) evaluated across 4 locked acute pediatric vignettes with 3 independent replicates per cell.</w:t>
@@ -464,7 +477,7 @@
       <w:r>
         <w:drawing>
           <wp:inline>
-            <wp:extent cx="5334000" cy="3241963"/>
+            <wp:extent cx="5334000" cy="3733800"/>
             <wp:effectExtent b="0" l="0" r="0" t="0"/>
             <wp:docPr descr="Audited Commercial CDS Scoreboard" title="" id="11" name="Picture"/>
             <a:graphic>
@@ -485,7 +498,7 @@
                   <pic:spPr bwMode="auto">
                     <a:xfrm>
                       <a:off x="0" y="0"/>
-                      <a:ext cx="5334000" cy="3241963"/>
+                      <a:ext cx="5334000" cy="3733800"/>
                     </a:xfrm>
                     <a:prstGeom prst="rect">
                       <a:avLst/>
@@ -513,13 +526,13 @@
       </w:r>
     </w:p>
     <w:bookmarkEnd w:id="13"/>
-    <w:bookmarkStart w:id="14" w:name="X5773094d7454594c14a88f5616855c2e0d02447"/>
+    <w:bookmarkStart w:id="14" w:name="X840474a9d44626abb5a3ecd249e1f5eef74be31"/>
     <w:p>
       <w:pPr>
         <w:pStyle w:val="Heading3"/>
       </w:pPr>
       <w:r>
-        <w:t xml:space="preserve">The Reconciled Commercial Error Count: 12 Hard Clinical Failures</w:t>
+        <w:t xml:space="preserve">The Reconciled Commercial Error Count: 15 Hard Clinical Failures</w:t>
       </w:r>
     </w:p>
     <w:p>
@@ -527,7 +540,7 @@
         <w:pStyle w:val="FirstParagraph"/>
       </w:pPr>
       <w:r>
-        <w:t xml:space="preserve">Initial automated passes and raw screening drafts suggested between 16 and 19 errors across the commercial tools. A forensic line-by-line audit grounded directly in raw disk captures revealed that several initial flags were</w:t>
+        <w:t xml:space="preserve">Initial automated passes and raw screening drafts suggested between 16 and 19 errors across the initial commercial tools. A forensic line-by-line audit grounded directly in raw disk captures revealed that several initial flags were</w:t>
       </w:r>
       <w:r>
         <w:t xml:space="preserve"> </w:t>
@@ -574,23 +587,23 @@
         <w:pStyle w:val="BodyText"/>
       </w:pPr>
       <w:r>
-        <w:t xml:space="preserve">Filtering out these defects leaves</w:t>
-      </w:r>
-      <w:r>
-        <w:t xml:space="preserve"> </w:t>
-      </w:r>
-      <w:r>
-        <w:rPr>
-          <w:b/>
-          <w:bCs/>
-        </w:rPr>
-        <w:t xml:space="preserve">12 defensible, hard clinical failures</w:t>
-      </w:r>
-      <w:r>
-        <w:t xml:space="preserve"> </w:t>
-      </w:r>
-      <w:r>
-        <w:t xml:space="preserve">across 72 encounters:</w:t>
+        <w:t xml:space="preserve">Filtering out these defects and integrating Glass Health leaves</w:t>
+      </w:r>
+      <w:r>
+        <w:t xml:space="preserve"> </w:t>
+      </w:r>
+      <w:r>
+        <w:rPr>
+          <w:b/>
+          <w:bCs/>
+        </w:rPr>
+        <w:t xml:space="preserve">15 defensible, hard clinical failures</w:t>
+      </w:r>
+      <w:r>
+        <w:t xml:space="preserve"> </w:t>
+      </w:r>
+      <w:r>
+        <w:t xml:space="preserve">across 84 encounters:</w:t>
       </w:r>
     </w:p>
     <w:p>
@@ -610,7 +623,7 @@
         <w:rPr>
           <w:rStyle w:val="VerbatimChar"/>
         </w:rPr>
-        <w:t xml:space="preserve">│                    RECONCILED COMMERCIAL CDS HARD CLINICAL FAILURES (N=12)                  │</w:t>
+        <w:t xml:space="preserve">│                    RECONCILED COMMERCIAL CDS HARD CLINICAL FAILURES (N=15)                  │</w:t>
       </w:r>
       <w:r>
         <w:br/>
@@ -692,6 +705,24 @@
           <w:rStyle w:val="VerbatimChar"/>
         </w:rPr>
         <w:t xml:space="preserve">│                          │       │ • 3 Complex Febrile Seizure Redefinitions (&gt;5–10 min)    │</w:t>
+      </w:r>
+      <w:r>
+        <w:br/>
+      </w:r>
+      <w:r>
+        <w:rPr>
+          <w:rStyle w:val="VerbatimChar"/>
+        </w:rPr>
+        <w:t xml:space="preserve">├──────────────────────────┼───────┼──────────────────────────────────────────────────────────┤</w:t>
+      </w:r>
+      <w:r>
+        <w:br/>
+      </w:r>
+      <w:r>
+        <w:rPr>
+          <w:rStyle w:val="VerbatimChar"/>
+        </w:rPr>
+        <w:t xml:space="preserve">│ Glass Health             │   3   │ • 3 Complex Febrile Seizure Redefinitions (5m conflation)│</w:t>
       </w:r>
       <w:r>
         <w:br/>

</xml_diff>